<commit_message>
small change in promot
</commit_message>
<xml_diff>
--- a/Md_Rawfur_Monzur_Jim_CV_new.docx
+++ b/Md_Rawfur_Monzur_Jim_CV_new.docx
@@ -32,7 +32,17 @@
           <w:sz w:val="18"/>
           <w:szCs w:val="18"/>
         </w:rPr>
-        <w:t>AI Engineer  Updated|  Production LLM Systems · Multi-Agent Pipelines · RAG · Fine-Tuning · Self-Hosted GPU Serving</w:t>
+        <w:t>AI Engineer</w:t>
+      </w:r>
+      <w:r>
+        <w:rPr>
+          <w:b/>
+          <w:bCs/>
+          <w:color w:val="294433"/>
+          <w:sz w:val="18"/>
+          <w:szCs w:val="18"/>
+        </w:rPr>
+        <w:t xml:space="preserve"> | Generative AI &amp; LLMs · RAG · AI Automation · AI Integration · Cloud &amp; API Solutions</w:t>
       </w:r>
     </w:p>
     <w:p>
@@ -125,43 +135,16 @@
         <w:spacing w:before="20" w:after="80"/>
       </w:pPr>
       <w:r>
-        <w:t xml:space="preserve">AI Engineer with almost three years’ experience building LLM systems that run in production. Currently leading the AI transformation at JudgeService Research Ltd: adding LLM features to the company’s review-analytics platform and building new AI products for the UK automotive sector, including a paid review-response service used by </w:t>
-      </w:r>
-      <w:r>
-        <w:rPr>
-          <w:b/>
-        </w:rPr>
-        <w:t>200+</w:t>
-      </w:r>
-      <w:r>
-        <w:t xml:space="preserve"> dealerships across the UK (</w:t>
-      </w:r>
-      <w:r>
-        <w:rPr>
-          <w:b/>
-        </w:rPr>
-        <w:t>100k+</w:t>
-      </w:r>
-      <w:r>
-        <w:t xml:space="preserve"> reviews a month, </w:t>
-      </w:r>
-      <w:r>
-        <w:rPr>
-          <w:b/>
-        </w:rPr>
-        <w:t>93%</w:t>
-      </w:r>
-      <w:r>
-        <w:t xml:space="preserve"> of drafts published unedited) and a multi-agent sentiment pipeline analysing </w:t>
-      </w:r>
-      <w:r>
-        <w:rPr>
-          <w:b/>
-        </w:rPr>
-        <w:t>30,000</w:t>
-      </w:r>
-      <w:r>
-        <w:t xml:space="preserve"> reviews a week. Hands-on across the whole stack: multi-agent design, fine-tuning (LoRA/QLoRA), RAG, evaluation, and keeping self-hosted GPU models running reliably.</w:t>
+        <w:t xml:space="preserve">AI Engineer with almost three years’ experience delivering </w:t>
+      </w:r>
+      <w:r>
+        <w:rPr>
+          <w:b/>
+        </w:rPr>
+        <w:t>Generative AI, LLM, and AI automation solutions</w:t>
+      </w:r>
+      <w:r>
+        <w:t xml:space="preserve"> into live business products. Currently leading AI transformation at JudgeService Research, integrating AI into an existing review-analytics platform and building new customer-facing AI products used by 200+ UK dealerships. Hands-on across the full stack: multi-agent pipelines, RAG, fine-tuning (LoRA/QLoRA), evaluation, and self-hosted GPU serving. Experienced translating business requirements into practical, scalable AI solutions, integrating via APIs, and deploying on cloud and on-prem environments. Commercially aware, with a track record of improving retention, generating recurring revenue, and communicating complex AI concepts to technical and non-technical stakeholders.</w:t>
       </w:r>
     </w:p>
     <w:p>
@@ -190,80 +173,80 @@
         <w:rPr>
           <w:b/>
         </w:rPr>
-        <w:t>LLM Engineering Updated:</w:t>
-      </w:r>
-      <w:r>
-        <w:t xml:space="preserve">  multi-agent systems, RAG, prompt and few-shot engineering, structured JSON output (Pydantic), LLM-as-a-judge, hallucination guards, evaluation-set design</w:t>
-      </w:r>
-    </w:p>
-    <w:p>
-      <w:pPr>
-        <w:spacing w:after="80"/>
-      </w:pPr>
-      <w:r>
-        <w:rPr>
-          <w:b/>
-        </w:rPr>
-        <w:t>Fine-Tuning &amp; Models:</w:t>
-      </w:r>
-      <w:r>
-        <w:t xml:space="preserve">  LLM fine-tuning (LoRA, QLoRA, Unsloth), knowledge distillation, Llama 3 (8B/70B), Gemma 4 31B, Gemini API, Groq</w:t>
-      </w:r>
-    </w:p>
-    <w:p>
-      <w:pPr>
-        <w:spacing w:after="80"/>
-      </w:pPr>
-      <w:r>
-        <w:rPr>
-          <w:b/>
-        </w:rPr>
-        <w:t>Serving &amp; MLOps:</w:t>
-      </w:r>
-      <w:r>
-        <w:t xml:space="preserve">  GPU serving (Ollama, NVIDIA GPU servers, cloud and on-prem), Docker, FastAPI, HAProxy, AWS EC2, KV-cache and concurrency tuning, health checks and alerting</w:t>
-      </w:r>
-    </w:p>
-    <w:p>
-      <w:pPr>
-        <w:spacing w:after="80"/>
-      </w:pPr>
-      <w:r>
-        <w:rPr>
-          <w:b/>
-        </w:rPr>
-        <w:t>Data &amp; Retrieval:</w:t>
-      </w:r>
-      <w:r>
-        <w:t xml:space="preserve">  LangChain, Chroma, embeddings (Linq-Embed-Mistral), WhisperX speech-to-text, SQL, star-schema data warehousing, Power BI</w:t>
-      </w:r>
-    </w:p>
-    <w:p>
-      <w:pPr>
-        <w:spacing w:after="80"/>
-      </w:pPr>
-      <w:r>
-        <w:rPr>
-          <w:b/>
-        </w:rPr>
-        <w:t>Engineering Practice:</w:t>
-      </w:r>
-      <w:r>
-        <w:t xml:space="preserve">  Python, JavaScript, TypeScript, OOP, PyTorch, scikit-learn, Git, GitHub Actions CI/CD, unit and regression testing, record/replay LLM test harness, Jira, agentic workflows (Claude Code, MCP)</w:t>
-      </w:r>
-    </w:p>
-    <w:p>
-      <w:pPr>
-        <w:spacing w:after="80"/>
-      </w:pPr>
-      <w:r>
-        <w:rPr>
-          <w:b/>
-        </w:rPr>
-        <w:t>Professional Skills:</w:t>
-      </w:r>
-      <w:r>
-        <w:t xml:space="preserve">  stakeholder communication, mentoring developers (internal LLM workshops), requirements gathering, end-to-end ownership of production systems, problem-solving</w:t>
+        <w:t>AI Solutions &amp; Implementation:</w:t>
+      </w:r>
+      <w:r>
+        <w:t xml:space="preserve">  Artificial Intelligence (AI) solutions, AI implementation, AI integration, AI automation, Generative AI, Large Language Models (LLMs), AI agents, multi-agent pipelines, RAG (Retrieval-Augmented Generation), prompt/few-shot engineering, structured JSON output, LLM-as-a-judge, hallucination guards, evaluation-set design, solution design, system integration, business process improvement, troubleshooting, optimisation, scalability, Responsible AI, privacy-first AI, privacy-first data handling, human-in-the-loop validation</w:t>
+      </w:r>
+    </w:p>
+    <w:p>
+      <w:pPr>
+        <w:spacing w:after="80"/>
+      </w:pPr>
+      <w:r>
+        <w:rPr>
+          <w:b/>
+        </w:rPr>
+        <w:t>Machine Learning &amp; Models:</w:t>
+      </w:r>
+      <w:r>
+        <w:t xml:space="preserve">  Machine learning, fine-tuning (LoRA, QLoRA), Unsloth, knowledge distillation, Llama 3 (8B/70B), Gemma 4 31B, PyTorch, scikit-learn, Gemini API, Groq</w:t>
+      </w:r>
+    </w:p>
+    <w:p>
+      <w:pPr>
+        <w:spacing w:after="80"/>
+      </w:pPr>
+      <w:r>
+        <w:rPr>
+          <w:b/>
+        </w:rPr>
+        <w:t>Cloud, APIs &amp; AI Services:</w:t>
+      </w:r>
+      <w:r>
+        <w:t xml:space="preserve">  Cloud platforms (AWS EC2), Cloud AI services (Gemini API, Groq), API integration, REST APIs, FastAPI, Docker, HAProxy, on-prem GPU servers, NVIDIA GPU servers, secure on-prem/self-hosted deployment, Ollama, KV-cache and concurrency tuning, health checks and alerting</w:t>
+      </w:r>
+    </w:p>
+    <w:p>
+      <w:pPr>
+        <w:spacing w:after="80"/>
+      </w:pPr>
+      <w:r>
+        <w:rPr>
+          <w:b/>
+        </w:rPr>
+        <w:t>Data, Retrieval &amp; Automation:</w:t>
+      </w:r>
+      <w:r>
+        <w:t xml:space="preserve">  LangChain, Chroma, embeddings (Linq-Embed-Mistral), Retrieval-Augmented Generation (RAG), WhisperX speech-to-text, SQL, star-schema data warehousing, Power BI, Power Query, DAX, Excel, AI workflows, workflow automation</w:t>
+      </w:r>
+    </w:p>
+    <w:p>
+      <w:pPr>
+        <w:spacing w:after="80"/>
+      </w:pPr>
+      <w:r>
+        <w:rPr>
+          <w:b/>
+        </w:rPr>
+        <w:t>Engineering &amp; Microsoft Ecosystem:</w:t>
+      </w:r>
+      <w:r>
+        <w:t xml:space="preserve">  Python, JavaScript, TypeScript, OOP, Git, GitHub Actions CI/CD, unit and regression testing, record/replay LLM test harness, Jira, agentic workflows (Claude Code, MCP), Microsoft Technologies / ecosystem (Power BI, Excel, Power Query, DAX)</w:t>
+      </w:r>
+    </w:p>
+    <w:p>
+      <w:pPr>
+        <w:spacing w:after="80"/>
+      </w:pPr>
+      <w:r>
+        <w:rPr>
+          <w:b/>
+        </w:rPr>
+        <w:t>Professional &amp; Customer-Facing:</w:t>
+      </w:r>
+      <w:r>
+        <w:t xml:space="preserve">  stakeholder management, communication with non-technical clients, requirements gathering, mentoring developers (internal LLM workshops), end-to-end ownership of production systems, problem-solving, commercial awareness, knowledge sharing, customer-facing delivery</w:t>
       </w:r>
     </w:p>
     <w:p>
@@ -303,7 +286,7 @@
           <w:sz w:val="24"/>
           <w:szCs w:val="24"/>
         </w:rPr>
-        <w:t>AI Engineer Gulu Gulu — JudgeService Research Ltd, UK</w:t>
+        <w:t>AI Engineer — JudgeService Research Ltd, UK</w:t>
       </w:r>
       <w:r>
         <w:rPr>
@@ -349,7 +332,7 @@
         <w:spacing w:after="80"/>
       </w:pPr>
       <w:r>
-        <w:t xml:space="preserve">Built and shipped a production </w:t>
+        <w:t xml:space="preserve">Built and shipped a client-facing </w:t>
       </w:r>
       <w:r>
         <w:rPr>
@@ -372,13 +355,7 @@
         <w:spacing w:after="80"/>
       </w:pPr>
       <w:r>
-        <w:rPr>
-          <w:b/>
-        </w:rPr>
-        <w:t>Fine-tuned</w:t>
-      </w:r>
-      <w:r>
-        <w:t xml:space="preserve"> Llama 3 8B with LoRA/QLoRA (Unsloth) on examples generated by Llama 3 70B to fix a rule the small model kept breaking (one dealer’s brand name an exact number of times in every reply), keeping its speed and low cost in production.</w:t>
+        <w:t>Fine-tuned Llama 3 8B with LoRA/QLoRA (Unsloth) on examples generated by Llama 3 70B to fix a rule the small model kept breaking (one dealer’s brand name an exact number of times in every reply), keeping its speed and low cost in production.</w:t>
       </w:r>
     </w:p>
     <w:p>
@@ -401,25 +378,7 @@
         <w:t>Docker</w:t>
       </w:r>
       <w:r>
-        <w:t xml:space="preserve"> behind a FastAPI REST API. Deployed first on </w:t>
-      </w:r>
-      <w:r>
-        <w:rPr>
-          <w:b/>
-        </w:rPr>
-        <w:t>AWS EC2,</w:t>
-      </w:r>
-      <w:r>
-        <w:t xml:space="preserve"> setting up NVIDIA drivers and the Linux environment from scratch, then led the move to the company’s own </w:t>
-      </w:r>
-      <w:r>
-        <w:rPr>
-          <w:b/>
-        </w:rPr>
-        <w:t>GPU</w:t>
-      </w:r>
-      <w:r>
-        <w:t xml:space="preserve"> server to cut running costs. Added database caching so repeat reviews never trigger a second model call.</w:t>
+        <w:t xml:space="preserve"> behind a FastAPI REST API. Deployed first on AWS EC2, setting up NVIDIA drivers and the Linux environment from scratch, then led the move to the company’s own GPU server to cut running costs. Added database caching so repeat reviews never trigger a second model call.</w:t>
       </w:r>
     </w:p>
     <w:p>
@@ -433,16 +392,7 @@
         <w:spacing w:after="80"/>
       </w:pPr>
       <w:r>
-        <w:t xml:space="preserve">Added automatic quality gates (rule-based checks plus an </w:t>
-      </w:r>
-      <w:r>
-        <w:rPr>
-          <w:b/>
-        </w:rPr>
-        <w:t>LLM-as-a-judge</w:t>
-      </w:r>
-      <w:r>
-        <w:t xml:space="preserve"> step) so poor drafts never reach a human. Dealers pick one of the three options every time, so their choices double as free feedback on which reply style works.</w:t>
+        <w:t>Added automatic quality gates (rule-based checks plus an LLM-as-a-judge step) so poor drafts never reach a human. Dealers pick one of the three options every time, so their choices double as free feedback on which reply style works.</w:t>
       </w:r>
     </w:p>
     <w:p>
@@ -478,16 +428,7 @@
         <w:t>multi-agent LLM</w:t>
       </w:r>
       <w:r>
-        <w:t xml:space="preserve"> pipeline that turns raw customer reviews into structured JSON for two insight dashboards (a general review-insight product and a sister product for negative reviews). Each agent does one job, from classifying the review to quoting evidence and linking sentiment to named staff. Analyses 30,000 reviews a week (</w:t>
-      </w:r>
-      <w:r>
-        <w:rPr>
-          <w:b/>
-        </w:rPr>
-        <w:t>1.5M+ a year</w:t>
-      </w:r>
-      <w:r>
-        <w:t>) and has helped the business win new clients and retain existing ones.</w:t>
+        <w:t xml:space="preserve"> pipeline that turns raw customer reviews into structured JSON for two client-facing insight dashboards (a general review-insight product and a sister product for negative reviews). Each agent does one job, from classifying the review to quoting evidence and linking sentiment to named staff. Analyses 30,000 reviews a week (1.5M+ a year) and has helped the business win new clients and retain existing ones.</w:t>
       </w:r>
     </w:p>
     <w:p>
@@ -507,19 +448,10 @@
       <w:r>
         <w:rPr>
           <w:rFonts w:ascii="Arial" w:hAnsi="Arial" w:cs="Arial"/>
-          <w:b/>
           <w:sz w:val="20"/>
           <w:szCs w:val="20"/>
         </w:rPr>
-        <w:t>Cut inference costs</w:t>
-      </w:r>
-      <w:r>
-        <w:rPr>
-          <w:rFonts w:ascii="Arial" w:hAnsi="Arial" w:cs="Arial"/>
-          <w:sz w:val="20"/>
-          <w:szCs w:val="20"/>
-        </w:rPr>
-        <w:t xml:space="preserve"> with a two-tier routing architecture: urgent single reviews go to the Gemini API for low-latency responses, while large batch jobs run on a self-hosted Gemma4 31B on the company's own GPU hardware, keeping per-review inference costs down.</w:t>
+        <w:t>Cut inference costs with a two-tier routing architecture: urgent single reviews go to the Gemini API for low-latency responses, while large batch jobs run on a self-hosted Gemma4 31B on the company's own GPU hardware, keeping per-review inference costs down.</w:t>
       </w:r>
     </w:p>
     <w:p>
@@ -543,26 +475,7 @@
           <w:szCs w:val="20"/>
           <w:lang w:val="en-GB"/>
         </w:rPr>
-        <w:t>Raised subcategory recall from 0.78 to 0.96 (</w:t>
-      </w:r>
-      <w:r>
-        <w:rPr>
-          <w:rFonts w:ascii="Arial" w:hAnsi="Arial" w:cs="Arial"/>
-          <w:b/>
-          <w:sz w:val="20"/>
-          <w:szCs w:val="20"/>
-          <w:lang w:val="en-GB"/>
-        </w:rPr>
-        <w:t>F1 0.98</w:t>
-      </w:r>
-      <w:r>
-        <w:rPr>
-          <w:rFonts w:ascii="Arial" w:hAnsi="Arial" w:cs="Arial"/>
-          <w:sz w:val="20"/>
-          <w:szCs w:val="20"/>
-          <w:lang w:val="en-GB"/>
-        </w:rPr>
-        <w:t>), measured on a 500-review golden set of hard cases, then locked the gains in with a regression suite that re-runs the set on every change and fails the build if accuracy drops.</w:t>
+        <w:t>Raised subcategory recall from 0.78 to 0.96 (F1 0.98), measured on a 500-review golden set of hard cases, then locked the gains in with a regression suite that re-runs the set on every change and fails the build if accuracy drops.</w:t>
       </w:r>
     </w:p>
     <w:p>
@@ -576,13 +489,7 @@
         <w:spacing w:after="80"/>
       </w:pPr>
       <w:r>
-        <w:rPr>
-          <w:b/>
-        </w:rPr>
-        <w:t>Engineered a zero-downtime LLM architecture</w:t>
-      </w:r>
-      <w:r>
-        <w:t xml:space="preserve"> using HAProxy and active-passive Ollama servers, featuring automated failover, self-healing restarts, and proactive IT alerting.</w:t>
+        <w:t>Engineered a zero-downtime LLM architecture using HAProxy and active-passive Ollama servers, featuring automated failover, self-healing restarts, and proactive IT alerting.</w:t>
       </w:r>
     </w:p>
     <w:p>
@@ -632,34 +539,7 @@
         <w:spacing w:after="80"/>
       </w:pPr>
       <w:r>
-        <w:t xml:space="preserve">Designed the retrieval end to end: </w:t>
-      </w:r>
-      <w:r>
-        <w:rPr>
-          <w:b/>
-        </w:rPr>
-        <w:t>LangChain</w:t>
-      </w:r>
-      <w:r>
-        <w:t xml:space="preserve"> ingestion, 2,000-character chunks, </w:t>
-      </w:r>
-      <w:r>
-        <w:rPr>
-          <w:b/>
-        </w:rPr>
-        <w:t>Linq-Embed-Mistral</w:t>
-      </w:r>
-      <w:r>
-        <w:t xml:space="preserve"> embeddings in a </w:t>
-      </w:r>
-      <w:r>
-        <w:rPr>
-          <w:b/>
-        </w:rPr>
-        <w:t>Chroma vector store</w:t>
-      </w:r>
-      <w:r>
-        <w:t>. For each chunk the system retrieves related code from across the repository, so the model understands calls into other files before it writes. A local Llama 3 drafts the documentation, and a second “technical writer” pass removes filler and formats clean Markdown.</w:t>
+        <w:t>Designed the retrieval end to end: LangChain ingestion, 2,000-character chunks, Linq-Embed-Mistral embeddings in a Chroma vector store. For each chunk the system retrieves related code from across the repository, so the model understands calls into other files before it writes. A local Llama 3 drafts the documentation, and a second 'technical writer' pass removes filler and formats clean Markdown.</w:t>
       </w:r>
     </w:p>
     <w:p>

</xml_diff>